<commit_message>
CM: SEC-CUI Rev 2 Approved (John Quinn, CEO, 2026-10-08; D-7282008, #3115) — AFRL CUI marking + no-email/DoD SAFE; register, Master List, Process Library; SEC-CUI-STOR email rule aligned
</commit_message>
<xml_diff>
--- a/process-library/08-security-cui/Exos_CUI_Policies_and_Procedures.docx
+++ b/process-library/08-security-cui/Exos_CUI_Policies_and_Procedures.docx
@@ -48,7 +48,7 @@
         <w:t>Version:</w:t>
       </w:r>
       <w:r>
-        <w:t xml:space="preserve"> 1.0 (Draft for adoption)</w:t>
+        <w:t xml:space="preserve"> 2.0 (Rev 2), APPROVED 2026-10-08</w:t>
       </w:r>
     </w:p>
     <w:p>
@@ -59,7 +59,7 @@
         <w:t>Effective Date:</w:t>
       </w:r>
       <w:r>
-        <w:t xml:space="preserve"> _______________</w:t>
+        <w:t xml:space="preserve"> 2026-10-08</w:t>
       </w:r>
     </w:p>
     <w:p>
@@ -81,7 +81,7 @@
         <w:t>Approved By:</w:t>
       </w:r>
       <w:r>
-        <w:t xml:space="preserve"> John Quinn, Cofounder &amp; CEO</w:t>
+        <w:t xml:space="preserve"> John Quinn, Cofounder &amp; CEO (approved 2026-10-08)</w:t>
       </w:r>
     </w:p>
     <w:p>
@@ -93,6 +93,17 @@
       </w:r>
       <w:r>
         <w:t xml:space="preserve"> Annual, or upon change to contracts, regulations, or IT environment</w:t>
+      </w:r>
+    </w:p>
+    <w:p>
+      <w:r>
+        <w:rPr>
+          <w:b/>
+        </w:rPr>
+        <w:t xml:space="preserve">Revision History: </w:t>
+      </w:r>
+      <w:r>
+        <w:t>Rev 2 (2026-10-08): adds Government-customer CUI transmission and marking-placement rules per AFRL/RJPE guidance to Exos (Dr. M. Harvazinski, 2026-09-29): no CUI by email to the Government; DoD SAFE drop-off link requested from the Government; "CUI" centered in every header and footer of every page and slide; designation indicator block in the lower-right corner of the first page/slide. Rev 1 (2026-07-21): initial reference framework.</w:t>
       </w:r>
     </w:p>
     <w:p>
@@ -994,7 +1005,7 @@
         <w:t>"PROPRIETARY — Exos Aerospace"</w:t>
       </w:r>
       <w:r>
-        <w:t xml:space="preserve"> (and, where applicable, "Export Controlled — ITAR/EAR"). Do not apply a CUI banner to purely internal proprietary material. When submitting proprietary material into a Government process, mark it Proprietary and acknowledge that the receiving agency may handle it as CU//SP-PROPIN; do not attest to a CUI category on the Government's behalf.</w:t>
+        <w:t xml:space="preserve"> (and, where applicable, "Export Controlled — ITAR/EAR"). Do not apply a CUI banner to purely internal proprietary material. When submitting proprietary material into a Government process, mark it Proprietary and acknowledge that the receiving agency may handle it as CUI//SP-PROPIN; do not attest to a CUI category on the Government's behalf.</w:t>
       </w:r>
     </w:p>
     <w:p>
@@ -1167,35 +1178,26 @@
     </w:p>
     <w:p>
       <w:r>
-        <w:t xml:space="preserve">Mark every page of a CUI document with </w:t>
-      </w:r>
-      <w:r>
-        <w:rPr>
-          <w:b/>
-        </w:rPr>
-        <w:t>"CUI"</w:t>
-      </w:r>
-      <w:r>
-        <w:t xml:space="preserve"> (or the fuller category marking) centered at the top and bottom. For CUI Specified, use the category form, e.g. </w:t>
-      </w:r>
-      <w:r>
-        <w:rPr>
-          <w:b/>
-        </w:rPr>
-        <w:t>CUI//SP-EXPT</w:t>
-      </w:r>
-      <w:r>
-        <w:t xml:space="preserve"> or </w:t>
-      </w:r>
-      <w:r>
-        <w:rPr>
-          <w:b/>
-        </w:rPr>
-        <w:t>CUI//SP-CTI</w:t>
-      </w:r>
-      <w:r>
-        <w:t>.</w:t>
-      </w:r>
+        <w:t>Mark every page of a CUI document, and every slide of a CUI presentation, with "CUI" (or the fuller category marking) centered in the header and centered in the footer. No page or slide is exempt, including cover, title, and back pages. For CUI Specified, use the category form, e.g. CUI//SP-EXPT or CUI//SP-CTI, unless the Government customer directs the plain "CUI" banner.</w:t>
+      </w:r>
+      <w:r>
+        <w:rPr>
+          <w:b/>
+        </w:rPr>
+      </w:r>
+      <w:r/>
+      <w:r>
+        <w:rPr>
+          <w:b/>
+        </w:rPr>
+      </w:r>
+      <w:r/>
+      <w:r>
+        <w:rPr>
+          <w:b/>
+        </w:rPr>
+      </w:r>
+      <w:r/>
     </w:p>
     <w:p>
       <w:pPr>
@@ -1213,7 +1215,7 @@
     </w:p>
     <w:p>
       <w:r>
-        <w:t>The first page (or transmittal) of Exos-generated CUI carries a designation block:</w:t>
+        <w:t>The first page of every Exos-generated CUI document, or the first slide of every CUI presentation, carries a designation indicator block placed in the LOWER-RIGHT CORNER of that page or slide. When the Government customer supplies its own designation block or contents, use theirs exactly. Default contents:</w:t>
       </w:r>
     </w:p>
     <w:p>
@@ -1287,17 +1289,14 @@
     </w:p>
     <w:p>
       <w:r>
-        <w:t xml:space="preserve">Put </w:t>
-      </w:r>
-      <w:r>
-        <w:rPr>
-          <w:b/>
-        </w:rPr>
-        <w:t>CUI</w:t>
-      </w:r>
-      <w:r>
-        <w:t xml:space="preserve"> in the subject line and at the top of the body of any email containing CUI. Encrypt in transit (see Section 9). CUI leaves the GCC High enclave only through approved, encrypted channels.</w:t>
-      </w:r>
+        <w:t>Do NOT transmit CUI by email, including encrypted email, to any Government customer. To deliver CUI to the Government, request a DoD SAFE drop-off link from the Government point of contact and upload the file through DoD SAFE (safe.apps.mil); the Government initiates the drop-off. Internally, and with authorized non-Government holders, share CUI only as SharePoint GCC High access links (SEC-CUI-STOR), never as email attachments or pasted content. An email may refer to CUI only by a non-sensitive title or link. CUI found in an email is a CUI incident (Section 10).</w:t>
+      </w:r>
+      <w:r>
+        <w:rPr>
+          <w:b/>
+        </w:rPr>
+      </w:r>
+      <w:r/>
     </w:p>
     <w:p>
       <w:pPr>
@@ -1494,11 +1493,9 @@
         <w:rPr>
           <w:b/>
         </w:rPr>
-        <w:t>Email:</w:t>
-      </w:r>
-      <w:r>
-        <w:t xml:space="preserve"> encrypted in transit; recipients must be authorized holders. Use enclave-native encryption; do not send CUI to consumer addresses.</w:t>
-      </w:r>
+        <w:t>Email: not an approved channel for transmitting CUI (see 7.4). Never attach CUI to, or paste CUI into, any email, encrypted or not.</w:t>
+      </w:r>
+      <w:r/>
     </w:p>
     <w:p>
       <w:pPr>
@@ -1512,11 +1509,9 @@
         <w:rPr>
           <w:b/>
         </w:rPr>
-        <w:t>File transfer:</w:t>
-      </w:r>
-      <w:r>
-        <w:t xml:space="preserve"> use the approved Government/enclave portal (e.g., DoD SAFE, agency PIEE/portal) for large or external CUI transfers.</w:t>
-      </w:r>
+        <w:t>File transfer to the Government: DoD SAFE via a drop-off link requested from the Government POC, or the agency portal the contract directs (e.g., PIEE). Other external transfers: SharePoint GCC High access links after export-control review.</w:t>
+      </w:r>
+      <w:r/>
     </w:p>
     <w:p>
       <w:pPr>
@@ -2126,16 +2121,46 @@
         <w:ind w:left="432" w:hanging="245"/>
       </w:pPr>
       <w:r>
+        <w:t>•  Banner (header AND footer, centered, every page and every slide): CUI or CUI//SP-EXPT / CUI//SP-CTI</w:t>
+      </w:r>
+      <w:r>
+        <w:rPr>
+          <w:b/>
+        </w:rPr>
+      </w:r>
+      <w:r/>
+    </w:p>
+    <w:p>
+      <w:pPr>
+        <w:spacing w:after="60"/>
+        <w:ind w:left="432" w:hanging="245"/>
+      </w:pPr>
+      <w:r>
+        <w:t>•  Email: NEVER send CUI by email. To deliver to the Government, request a DoD SAFE drop-off link from the Government POC.</w:t>
+      </w:r>
+      <w:r>
+        <w:rPr>
+          <w:b/>
+        </w:rPr>
+      </w:r>
+      <w:r/>
+    </w:p>
+    <w:p>
+      <w:pPr>
+        <w:spacing w:after="60"/>
+        <w:ind w:left="432" w:hanging="245"/>
+      </w:pPr>
+      <w:r>
         <w:t xml:space="preserve">•  </w:t>
       </w:r>
       <w:r>
         <w:rPr>
           <w:b/>
         </w:rPr>
-        <w:t>Banner (top &amp; bottom, every page):</w:t>
-      </w:r>
-      <w:r>
-        <w:t xml:space="preserve"> `CUI` or `CUI//SP-EXPT` / `CUI//SP-CTI`</w:t>
+        <w:t>Never</w:t>
+      </w:r>
+      <w:r>
+        <w:t xml:space="preserve"> use `FOUO`, `Confidential`, `SBU`, or `Secret` for CUI.</w:t>
       </w:r>
     </w:p>
     <w:p>
@@ -2150,42 +2175,6 @@
         <w:rPr>
           <w:b/>
         </w:rPr>
-        <w:t>Email:</w:t>
-      </w:r>
-      <w:r>
-        <w:t xml:space="preserve"> `CUI` in subject and first line of body; encrypted; authorized recipients only.</w:t>
-      </w:r>
-    </w:p>
-    <w:p>
-      <w:pPr>
-        <w:spacing w:after="60"/>
-        <w:ind w:left="432" w:hanging="245"/>
-      </w:pPr>
-      <w:r>
-        <w:t xml:space="preserve">•  </w:t>
-      </w:r>
-      <w:r>
-        <w:rPr>
-          <w:b/>
-        </w:rPr>
-        <w:t>Never</w:t>
-      </w:r>
-      <w:r>
-        <w:t xml:space="preserve"> use `FOUO`, `Confidential`, `SBU`, or `Secret` for CUI.</w:t>
-      </w:r>
-    </w:p>
-    <w:p>
-      <w:pPr>
-        <w:spacing w:after="60"/>
-        <w:ind w:left="432" w:hanging="245"/>
-      </w:pPr>
-      <w:r>
-        <w:t xml:space="preserve">•  </w:t>
-      </w:r>
-      <w:r>
-        <w:rPr>
-          <w:b/>
-        </w:rPr>
         <w:t>Exos-only proprietary (no Government obligation):</w:t>
       </w:r>
       <w:r>
@@ -2198,17 +2187,14 @@
         <w:ind w:left="432" w:hanging="245"/>
       </w:pPr>
       <w:r>
-        <w:t xml:space="preserve">•  </w:t>
-      </w:r>
-      <w:r>
-        <w:rPr>
-          <w:b/>
-        </w:rPr>
-        <w:t>Designation block</w:t>
-      </w:r>
-      <w:r>
-        <w:t xml:space="preserve"> on Exos-generated CUI: Controlled by / Category / Distribution-LDC / POC.</w:t>
-      </w:r>
+        <w:t>•  Designation indicator block: lower-right corner of the first page/slide. Controlled by / Category / Distribution-LDC / POC (or the Government customer's block, exactly).</w:t>
+      </w:r>
+      <w:r>
+        <w:rPr>
+          <w:b/>
+        </w:rPr>
+      </w:r>
+      <w:r/>
     </w:p>
     <w:p>
       <w:pPr>
@@ -2232,7 +2218,7 @@
         <w:t>Approved:</w:t>
       </w:r>
       <w:r>
-        <w:t xml:space="preserve"> Exos GCC High enclave (Atomus-managed), approved Government portals (DoD SAFE, PIEE), locked physical storage on site.</w:t>
+        <w:t xml:space="preserve"> DoD SAFE (Government-requested drop-off link) for delivery to the Government; Exos GCC High enclave (Atomus-managed) and SharePoint GCC High access links; agency portals the contract directs (PIEE); locked physical storage on site.</w:t>
       </w:r>
     </w:p>
     <w:p>
@@ -2243,7 +2229,7 @@
         <w:t>Prohibited:</w:t>
       </w:r>
       <w:r>
-        <w:t xml:space="preserve"> personal email, personal or consumer cloud storage, personal phones/laptops, consumer messaging/SMS, unmanaged USB/removable media, home printers, and any commercial (non-GCC High) tenant not assessed for CUI.</w:t>
+        <w:t xml:space="preserve"> any email (personal or company, encrypted or not), personal or consumer cloud storage, personal phones/laptops, consumer messaging/SMS, unmanaged USB/removable media, home printers, and any commercial (non-GCC High) tenant not assessed for CUI.</w:t>
       </w:r>
     </w:p>
     <w:p>

</xml_diff>